<commit_message>
Update day-of program to the final version
Program previews, full-resolution pages, the print PDF and the large
print edition all refreshed from 2026_Gala_Program_FINAL.pdf.

Changed in this version: all 15 Silver sponsors listed with full business
names from the gala business plan; presenter names off the run of show;
Blue Moon credit removed and R&J Discount Liquor added; invocation moved
ahead of the national anthem; $500 level moved onto the Your Impact page;
Paddle Drop given its own page with the last-chance-to-give line; menu
page rebuilt to even out the spacing under the title.

Co-Authored-By: Claude Opus 5 <noreply@anthropic.com>
Claude-Session: https://claude.ai/code/session_01WhP5V5GRsyjrhchLSMVTFf
</commit_message>
<xml_diff>
--- a/assets/program/2026-gala-program-large-print.docx
+++ b/assets/program/2026-gala-program-large-print.docx
@@ -173,7 +173,7 @@
         <w:rPr>
           <w:b w:val="0"/>
         </w:rPr>
-        <w:t>Refreshments by Blue Moon.</w:t>
+        <w:t>Spirits by R&amp;J Discount Liquor.</w:t>
       </w:r>
     </w:p>
     <w:p>
@@ -190,7 +190,7 @@
         <w:rPr>
           <w:b w:val="0"/>
         </w:rPr>
-        <w:t>Presented by Michael Monteferrante, President and CEO, and Molly Edwards-Workman, SVP, Foundation and Mission Services.</w:t>
+        <w:t>Invocation.</w:t>
       </w:r>
     </w:p>
     <w:p>
@@ -199,16 +199,7 @@
         <w:rPr>
           <w:b w:val="0"/>
         </w:rPr>
-        <w:t>National Anthem performed by Hashim Sayed.</w:t>
-      </w:r>
-    </w:p>
-    <w:p>
-      <w:pPr/>
-      <w:r>
-        <w:rPr>
-          <w:b w:val="0"/>
-        </w:rPr>
-        <w:t>Invocation by Rev. Dr. Robin McGonigle.</w:t>
+        <w:t>National Anthem.</w:t>
       </w:r>
     </w:p>
     <w:p>
@@ -233,7 +224,7 @@
         <w:pStyle w:val="Heading3"/>
       </w:pPr>
       <w:r>
-        <w:t>7:30 PM, Fund-A-Need hosted by Charlie Moon</w:t>
+        <w:t>7:30 PM, Fund-A-Need</w:t>
       </w:r>
     </w:p>
     <w:p>
@@ -328,7 +319,7 @@
         <w:rPr>
           <w:b w:val="0"/>
         </w:rPr>
-        <w:t>Dinner by Scotch &amp; Sirloin. Refreshments by Blue Moon.</w:t>
+        <w:t>Dinner by Scotch &amp; Sirloin. Spirits by R&amp;J Discount Liquor.</w:t>
       </w:r>
     </w:p>
     <w:p>
@@ -666,6 +657,15 @@
       </w:r>
     </w:p>
     <w:p>
+      <w:pPr/>
+      <w:r>
+        <w:rPr>
+          <w:b/>
+        </w:rPr>
+        <w:t>Your last chance to give tonight.</w:t>
+      </w:r>
+    </w:p>
+    <w:p>
       <w:pPr>
         <w:spacing w:after="240"/>
       </w:pPr>
@@ -805,7 +805,7 @@
         <w:pStyle w:val="ListBullet"/>
       </w:pPr>
       <w:r>
-        <w:t>High Touch Technologies</w:t>
+        <w:t>High Touch Technologies, Inc.</w:t>
       </w:r>
     </w:p>
     <w:p>
@@ -821,7 +821,7 @@
         <w:pStyle w:val="ListBullet"/>
       </w:pPr>
       <w:r>
-        <w:t>Forvis Mazars</w:t>
+        <w:t>Forvis Mazars, LLP</w:t>
       </w:r>
     </w:p>
     <w:p>
@@ -837,7 +837,7 @@
         <w:pStyle w:val="ListBullet"/>
       </w:pPr>
       <w:r>
-        <w:t>INTRUST Bank</w:t>
+        <w:t>INTRUST Bank, N.A.</w:t>
       </w:r>
     </w:p>
     <w:p>
@@ -869,7 +869,7 @@
         <w:pStyle w:val="ListBullet"/>
       </w:pPr>
       <w:r>
-        <w:t>IMA</w:t>
+        <w:t>IMA, Inc.</w:t>
       </w:r>
     </w:p>
     <w:p>
@@ -893,7 +893,7 @@
         <w:pStyle w:val="ListBullet"/>
       </w:pPr>
       <w:r>
-        <w:t>ADS</w:t>
+        <w:t>Account Recovery Specialists, Inc.</w:t>
       </w:r>
     </w:p>
     <w:p>
@@ -901,7 +901,31 @@
         <w:pStyle w:val="ListBullet"/>
       </w:pPr>
       <w:r>
-        <w:t>Belleville Boot</w:t>
+        <w:t>ADS, Inc.</w:t>
+      </w:r>
+    </w:p>
+    <w:p>
+      <w:pPr>
+        <w:pStyle w:val="ListBullet"/>
+      </w:pPr>
+      <w:r>
+        <w:t>Bank of America</w:t>
+      </w:r>
+    </w:p>
+    <w:p>
+      <w:pPr>
+        <w:pStyle w:val="ListBullet"/>
+      </w:pPr>
+      <w:r>
+        <w:t>Belleville Boot Company</w:t>
+      </w:r>
+    </w:p>
+    <w:p>
+      <w:pPr>
+        <w:pStyle w:val="ListBullet"/>
+      </w:pPr>
+      <w:r>
+        <w:t>Blue Cross and Blue Shield of Kansas</w:t>
       </w:r>
     </w:p>
     <w:p>
@@ -917,7 +941,7 @@
         <w:pStyle w:val="ListBullet"/>
       </w:pPr>
       <w:r>
-        <w:t>Eby Construction</w:t>
+        <w:t>Eby Construction Company</w:t>
       </w:r>
     </w:p>
     <w:p>
@@ -925,7 +949,23 @@
         <w:pStyle w:val="ListBullet"/>
       </w:pPr>
       <w:r>
-        <w:t>Enza Financial</w:t>
+        <w:t>Emprise Bank</w:t>
+      </w:r>
+    </w:p>
+    <w:p>
+      <w:pPr>
+        <w:pStyle w:val="ListBullet"/>
+      </w:pPr>
+      <w:r>
+        <w:t>Enza Financial, LLC</w:t>
+      </w:r>
+    </w:p>
+    <w:p>
+      <w:pPr>
+        <w:pStyle w:val="ListBullet"/>
+      </w:pPr>
+      <w:r>
+        <w:t>John and Julie Dombo</w:t>
       </w:r>
     </w:p>
     <w:p>
@@ -942,6 +982,22 @@
       </w:pPr>
       <w:r>
         <w:t>Novolex</w:t>
+      </w:r>
+    </w:p>
+    <w:p>
+      <w:pPr>
+        <w:pStyle w:val="ListBullet"/>
+      </w:pPr>
+      <w:r>
+        <w:t>Pitt Plastics</w:t>
+      </w:r>
+    </w:p>
+    <w:p>
+      <w:pPr>
+        <w:pStyle w:val="ListBullet"/>
+      </w:pPr>
+      <w:r>
+        <w:t>R.K. Black, Inc.</w:t>
       </w:r>
     </w:p>
     <w:p>
@@ -981,7 +1037,7 @@
         <w:pStyle w:val="ListBullet"/>
       </w:pPr>
       <w:r>
-        <w:t>S.P. Richards</w:t>
+        <w:t>S.P. Richards Company</w:t>
       </w:r>
     </w:p>
     <w:p>

</xml_diff>

<commit_message>
Apply Molly's markup to the day-of program
Her commented PDF plus the timing from her email:
- R&J Liquor for spirits, ABC Discount Liquor for wine (pages 4 and 5)
- Beren Room page: ERI credit removed, "the" unbolded, Arts "Program"
  to "Arts" and "Arts team", "intimate" to "guided", "Experiences
  sponsored by", refreshments line cut
- National Anthem now ahead of Invocation
- 7:30 The Envision Journey, Fund-A-Need moves to 7:45
- Paddle Drop drops "at the level you choose"

Large print edition rebuilt to match.

Co-Authored-By: Claude Opus 5 <noreply@anthropic.com>
Claude-Session: https://claude.ai/code/session_01WhP5V5GRsyjrhchLSMVTFf
</commit_message>
<xml_diff>
--- a/assets/program/2026-gala-program-large-print.docx
+++ b/assets/program/2026-gala-program-large-print.docx
@@ -173,7 +173,7 @@
         <w:rPr>
           <w:b w:val="0"/>
         </w:rPr>
-        <w:t>Spirits by R&amp;J Discount Liquor.</w:t>
+        <w:t>Spirits by R&amp;J Liquor and wine by ABC Discount Liquor.</w:t>
       </w:r>
     </w:p>
     <w:p>
@@ -190,7 +190,7 @@
         <w:rPr>
           <w:b w:val="0"/>
         </w:rPr>
-        <w:t>Invocation.</w:t>
+        <w:t>National Anthem.</w:t>
       </w:r>
     </w:p>
     <w:p>
@@ -199,7 +199,7 @@
         <w:rPr>
           <w:b w:val="0"/>
         </w:rPr>
-        <w:t>National Anthem.</w:t>
+        <w:t>Invocation.</w:t>
       </w:r>
     </w:p>
     <w:p>
@@ -224,7 +224,15 @@
         <w:pStyle w:val="Heading3"/>
       </w:pPr>
       <w:r>
-        <w:t>7:30 PM, Fund-A-Need</w:t>
+        <w:t>7:30 PM, The Envision Journey</w:t>
+      </w:r>
+    </w:p>
+    <w:p>
+      <w:pPr>
+        <w:pStyle w:val="Heading3"/>
+      </w:pPr>
+      <w:r>
+        <w:t>7:45 PM, Fund-A-Need</w:t>
       </w:r>
     </w:p>
     <w:p>
@@ -319,7 +327,7 @@
         <w:rPr>
           <w:b w:val="0"/>
         </w:rPr>
-        <w:t>Dinner by Scotch &amp; Sirloin. Spirits by R&amp;J Discount Liquor.</w:t>
+        <w:t>Dinner by Scotch &amp; Sirloin. Spirits by R&amp;J Liquor. Wine by ABC Discount Liquor.</w:t>
       </w:r>
     </w:p>
     <w:p>
@@ -353,7 +361,7 @@
         <w:rPr>
           <w:b w:val="0"/>
         </w:rPr>
-        <w:t>Presented by the Envision Vision Rehabilitation Center &amp; Research Institute Team.</w:t>
+        <w:t>Presented by the Envision Vision Rehabilitation Center.</w:t>
       </w:r>
     </w:p>
     <w:p>
@@ -362,7 +370,7 @@
         <w:rPr>
           <w:b w:val="0"/>
         </w:rPr>
-        <w:t>Guests are invited to experience Meta smart glasses through an intimate demonstration led by Envision's clinical and research teams. Discover how emerging assistive technologies are expanding access, independence and possibility for people who are blind or have low vision.</w:t>
+        <w:t>Guests are invited to experience Meta smart glasses through a guided demonstration led by Envision's clinical team. Discover how emerging assistive technologies are expanding access, independence and possibility for people who are blind or have low vision.</w:t>
       </w:r>
     </w:p>
     <w:p>
@@ -379,7 +387,7 @@
         <w:rPr>
           <w:b w:val="0"/>
         </w:rPr>
-        <w:t>Presented by the Envision Arts Program.</w:t>
+        <w:t>Presented by the Envision Arts.</w:t>
       </w:r>
     </w:p>
     <w:p>
@@ -388,7 +396,7 @@
         <w:rPr>
           <w:b w:val="0"/>
         </w:rPr>
-        <w:t>Experience art through a different perspective. The Beren Room features a curated selection of tactile works presented by the Envision Arts Program, inviting guests to engage with each piece through touch.</w:t>
+        <w:t>Experience art through a different perspective. The Beren Room features a curated selection of tactile works presented by the Envision Arts team, inviting guests to engage with each piece through touch.</w:t>
       </w:r>
     </w:p>
     <w:p>
@@ -397,7 +405,7 @@
         <w:rPr>
           <w:b w:val="0"/>
         </w:rPr>
-        <w:t>Sponsored by High Touch Technologies, Forvis Mazars, 6 Meridian, Hutton, IMA and Summit Films. Refreshments are served in the Beren Room.</w:t>
+        <w:t>Experiences sponsored by High Touch Technologies, Forvis Mazars, 6 Meridian, Hutton, IMA and Summit Films.</w:t>
       </w:r>
     </w:p>
     <w:p>
@@ -490,7 +498,7 @@
         <w:pStyle w:val="Heading3"/>
       </w:pPr>
       <w:r>
-        <w:t>Meet Stephen</w:t>
+        <w:t>Meet Steven</w:t>
       </w:r>
     </w:p>
     <w:p>
@@ -499,7 +507,7 @@
         <w:rPr>
           <w:b w:val="0"/>
         </w:rPr>
-        <w:t>For nearly 25 years, Stephen has been an integral part of the Envision community, as both a participant in Envision programs and a longtime member of the Envision workforce. His story reflects the enduring power of meaningful employment, connection and opportunity over a lifetime.</w:t>
+        <w:t>For nearly 25 years, Steven has been an integral part of the Envision community, as both a participant in Envision programs and a longtime member of the Envision workforce. His story reflects the enduring power of meaningful employment, connection and opportunity over a lifetime.</w:t>
       </w:r>
     </w:p>
     <w:p>
@@ -693,7 +701,7 @@
         <w:rPr>
           <w:b w:val="0"/>
         </w:rPr>
-        <w:t>Raise your paddle at the level you choose, then drop your bidder number in the basket.</w:t>
+        <w:t>Raise your paddle, then drop your bidder number in the basket.</w:t>
       </w:r>
     </w:p>
     <w:p>

</xml_diff>

<commit_message>
Add Atlas Electric, LLC to the Silver sponsors
Sixteen Silver sponsors now, in both the print program and the
large print edition.

Co-Authored-By: Claude Opus 5 <noreply@anthropic.com>
Claude-Session: https://claude.ai/code/session_01WhP5V5GRsyjrhchLSMVTFf
</commit_message>
<xml_diff>
--- a/assets/program/2026-gala-program-large-print.docx
+++ b/assets/program/2026-gala-program-large-print.docx
@@ -917,6 +917,14 @@
         <w:pStyle w:val="ListBullet"/>
       </w:pPr>
       <w:r>
+        <w:t>Atlas Electric, LLC</w:t>
+      </w:r>
+    </w:p>
+    <w:p>
+      <w:pPr>
+        <w:pStyle w:val="ListBullet"/>
+      </w:pPr>
+      <w:r>
         <w:t>Bank of America</w:t>
       </w:r>
     </w:p>

</xml_diff>

<commit_message>
Update day-of program: page 4 rework and Aruba fine print
- "In the Beren Room" removed from the 5:30 line
- vendor and presenting credits set in Medium Italic on their own line,
  so the bold program items read first
- body copy under the times moved from Regular to Medium for weight
- Invocation back above National Anthem
- Aruba: "Employees of Envision are not eligible to purchase."

Large print edition matches.

Co-Authored-By: Claude Opus 5 <noreply@anthropic.com>
Claude-Session: https://claude.ai/code/session_01WhP5V5GRsyjrhchLSMVTFf
</commit_message>
<xml_diff>
--- a/assets/program/2026-gala-program-large-print.docx
+++ b/assets/program/2026-gala-program-large-print.docx
@@ -164,7 +164,7 @@
         <w:rPr>
           <w:b w:val="0"/>
         </w:rPr>
-        <w:t>Innovative Assistive Technology and Tactile Art Experiences in the Beren Room.</w:t>
+        <w:t>Innovative Assistive Technology and Tactile Art Experiences.</w:t>
       </w:r>
     </w:p>
     <w:p>
@@ -190,7 +190,7 @@
         <w:rPr>
           <w:b w:val="0"/>
         </w:rPr>
-        <w:t>National Anthem.</w:t>
+        <w:t>Invocation.</w:t>
       </w:r>
     </w:p>
     <w:p>
@@ -199,7 +199,7 @@
         <w:rPr>
           <w:b w:val="0"/>
         </w:rPr>
-        <w:t>Invocation.</w:t>
+        <w:t>National Anthem.</w:t>
       </w:r>
     </w:p>
     <w:p>
@@ -780,7 +780,7 @@
         <w:rPr>
           <w:b w:val="0"/>
         </w:rPr>
-        <w:t>Subject to availability and blackout dates. Travel complete by December 2027. Employees of Envision are not eligible.</w:t>
+        <w:t>Subject to availability and blackout dates. Travel complete by December 2027. Employees of Envision are not eligible to purchase.</w:t>
       </w:r>
     </w:p>
     <w:p>

</xml_diff>

<commit_message>
Update the day-of program: page 4 rework and Aruba fine print
Picks up the changes made after FINAL-2:
- "In the Beren Room" removed from the 5:30 line
- vendor and presenting credits in Medium Italic on their own line, so
  the bold program items read first
- body copy under the times moved from Regular to Medium for weight
- Invocation back above National Anthem
- Aruba: "Employees of Envision are not eligible to purchase."

Program assets only; nothing else on the dashboard is touched.

Co-Authored-By: Claude Opus 5 <noreply@anthropic.com>
Claude-Session: https://claude.ai/code/session_01WhP5V5GRsyjrhchLSMVTFf
</commit_message>
<xml_diff>
--- a/assets/program/2026-gala-program-large-print.docx
+++ b/assets/program/2026-gala-program-large-print.docx
@@ -164,7 +164,7 @@
         <w:rPr>
           <w:b w:val="0"/>
         </w:rPr>
-        <w:t>Innovative Assistive Technology and Tactile Art Experiences in the Beren Room.</w:t>
+        <w:t>Innovative Assistive Technology and Tactile Art Experiences.</w:t>
       </w:r>
     </w:p>
     <w:p>
@@ -173,7 +173,7 @@
         <w:rPr>
           <w:b w:val="0"/>
         </w:rPr>
-        <w:t>Refreshments by Blue Moon.</w:t>
+        <w:t>Spirits by R&amp;J Liquor and wine by ABC Discount Liquor.</w:t>
       </w:r>
     </w:p>
     <w:p>
@@ -190,7 +190,7 @@
         <w:rPr>
           <w:b w:val="0"/>
         </w:rPr>
-        <w:t>Presented by Michael Monteferrante, President and CEO, and Molly Edwards-Workman, SVP, Foundation and Mission Services.</w:t>
+        <w:t>Invocation.</w:t>
       </w:r>
     </w:p>
     <w:p>
@@ -199,16 +199,7 @@
         <w:rPr>
           <w:b w:val="0"/>
         </w:rPr>
-        <w:t>National Anthem performed by Hashim Sayed.</w:t>
-      </w:r>
-    </w:p>
-    <w:p>
-      <w:pPr/>
-      <w:r>
-        <w:rPr>
-          <w:b w:val="0"/>
-        </w:rPr>
-        <w:t>Invocation by Rev. Dr. Robin McGonigle.</w:t>
+        <w:t>National Anthem.</w:t>
       </w:r>
     </w:p>
     <w:p>
@@ -233,7 +224,15 @@
         <w:pStyle w:val="Heading3"/>
       </w:pPr>
       <w:r>
-        <w:t>7:30 PM, Fund-A-Need hosted by Charlie Moon</w:t>
+        <w:t>7:30 PM, The Envision Journey</w:t>
+      </w:r>
+    </w:p>
+    <w:p>
+      <w:pPr>
+        <w:pStyle w:val="Heading3"/>
+      </w:pPr>
+      <w:r>
+        <w:t>7:45 PM, Fund-A-Need</w:t>
       </w:r>
     </w:p>
     <w:p>
@@ -328,7 +327,7 @@
         <w:rPr>
           <w:b w:val="0"/>
         </w:rPr>
-        <w:t>Dinner by Scotch &amp; Sirloin. Refreshments by Blue Moon.</w:t>
+        <w:t>Dinner by Scotch &amp; Sirloin. Spirits by R&amp;J Liquor. Wine by ABC Discount Liquor.</w:t>
       </w:r>
     </w:p>
     <w:p>
@@ -362,7 +361,7 @@
         <w:rPr>
           <w:b w:val="0"/>
         </w:rPr>
-        <w:t>Presented by the Envision Vision Rehabilitation Center &amp; Research Institute Team.</w:t>
+        <w:t>Presented by the Envision Vision Rehabilitation Center.</w:t>
       </w:r>
     </w:p>
     <w:p>
@@ -371,7 +370,7 @@
         <w:rPr>
           <w:b w:val="0"/>
         </w:rPr>
-        <w:t>Guests are invited to experience Meta smart glasses through an intimate demonstration led by Envision's clinical and research teams. Discover how emerging assistive technologies are expanding access, independence and possibility for people who are blind or have low vision.</w:t>
+        <w:t>Guests are invited to experience Meta smart glasses through a guided demonstration led by Envision's clinical team. Discover how emerging assistive technologies are expanding access, independence and possibility for people who are blind or have low vision.</w:t>
       </w:r>
     </w:p>
     <w:p>
@@ -388,7 +387,7 @@
         <w:rPr>
           <w:b w:val="0"/>
         </w:rPr>
-        <w:t>Presented by the Envision Arts Program.</w:t>
+        <w:t>Presented by the Envision Arts.</w:t>
       </w:r>
     </w:p>
     <w:p>
@@ -397,7 +396,7 @@
         <w:rPr>
           <w:b w:val="0"/>
         </w:rPr>
-        <w:t>Experience art through a different perspective. The Beren Room features a curated selection of tactile works presented by the Envision Arts Program, inviting guests to engage with each piece through touch.</w:t>
+        <w:t>Experience art through a different perspective. The Beren Room features a curated selection of tactile works presented by the Envision Arts team, inviting guests to engage with each piece through touch.</w:t>
       </w:r>
     </w:p>
     <w:p>
@@ -406,7 +405,7 @@
         <w:rPr>
           <w:b w:val="0"/>
         </w:rPr>
-        <w:t>Sponsored by High Touch Technologies, Forvis Mazars, 6 Meridian, Hutton, IMA and Summit Films. Refreshments are served in the Beren Room.</w:t>
+        <w:t>Experiences sponsored by High Touch Technologies, Forvis Mazars, 6 Meridian, Hutton, IMA and Summit Films.</w:t>
       </w:r>
     </w:p>
     <w:p>
@@ -499,7 +498,7 @@
         <w:pStyle w:val="Heading3"/>
       </w:pPr>
       <w:r>
-        <w:t>Meet Stephen</w:t>
+        <w:t>Meet Steven</w:t>
       </w:r>
     </w:p>
     <w:p>
@@ -508,7 +507,7 @@
         <w:rPr>
           <w:b w:val="0"/>
         </w:rPr>
-        <w:t>For nearly 25 years, Stephen has been an integral part of the Envision community, as both a participant in Envision programs and a longtime member of the Envision workforce. His story reflects the enduring power of meaningful employment, connection and opportunity over a lifetime.</w:t>
+        <w:t>For nearly 25 years, Steven has been an integral part of the Envision community, as both a participant in Envision programs and a longtime member of the Envision workforce. His story reflects the enduring power of meaningful employment, connection and opportunity over a lifetime.</w:t>
       </w:r>
     </w:p>
     <w:p>
@@ -666,6 +665,15 @@
       </w:r>
     </w:p>
     <w:p>
+      <w:pPr/>
+      <w:r>
+        <w:rPr>
+          <w:b/>
+        </w:rPr>
+        <w:t>Your last chance to give tonight.</w:t>
+      </w:r>
+    </w:p>
+    <w:p>
       <w:pPr>
         <w:spacing w:after="240"/>
       </w:pPr>
@@ -693,7 +701,7 @@
         <w:rPr>
           <w:b w:val="0"/>
         </w:rPr>
-        <w:t>Raise your paddle at the level you choose, then drop your bidder number in the basket.</w:t>
+        <w:t>Raise your paddle, then drop your bidder number in the basket.</w:t>
       </w:r>
     </w:p>
     <w:p>
@@ -772,7 +780,7 @@
         <w:rPr>
           <w:b w:val="0"/>
         </w:rPr>
-        <w:t>Subject to availability and blackout dates. Travel complete by December 2027. Employees of Envision are not eligible.</w:t>
+        <w:t>Subject to availability and blackout dates. Travel complete by December 2027. Employees of Envision are not eligible to purchase.</w:t>
       </w:r>
     </w:p>
     <w:p>
@@ -805,7 +813,7 @@
         <w:pStyle w:val="ListBullet"/>
       </w:pPr>
       <w:r>
-        <w:t>High Touch Technologies</w:t>
+        <w:t>High Touch Technologies, Inc.</w:t>
       </w:r>
     </w:p>
     <w:p>
@@ -821,7 +829,7 @@
         <w:pStyle w:val="ListBullet"/>
       </w:pPr>
       <w:r>
-        <w:t>Forvis Mazars</w:t>
+        <w:t>Forvis Mazars, LLP</w:t>
       </w:r>
     </w:p>
     <w:p>
@@ -837,7 +845,7 @@
         <w:pStyle w:val="ListBullet"/>
       </w:pPr>
       <w:r>
-        <w:t>INTRUST Bank</w:t>
+        <w:t>INTRUST Bank, N.A.</w:t>
       </w:r>
     </w:p>
     <w:p>
@@ -869,7 +877,7 @@
         <w:pStyle w:val="ListBullet"/>
       </w:pPr>
       <w:r>
-        <w:t>IMA</w:t>
+        <w:t>IMA, Inc.</w:t>
       </w:r>
     </w:p>
     <w:p>
@@ -893,7 +901,7 @@
         <w:pStyle w:val="ListBullet"/>
       </w:pPr>
       <w:r>
-        <w:t>ADS</w:t>
+        <w:t>Account Recovery Specialists, Inc.</w:t>
       </w:r>
     </w:p>
     <w:p>
@@ -901,7 +909,39 @@
         <w:pStyle w:val="ListBullet"/>
       </w:pPr>
       <w:r>
-        <w:t>Belleville Boot</w:t>
+        <w:t>ADS, Inc.</w:t>
+      </w:r>
+    </w:p>
+    <w:p>
+      <w:pPr>
+        <w:pStyle w:val="ListBullet"/>
+      </w:pPr>
+      <w:r>
+        <w:t>Atlas Electric, LLC</w:t>
+      </w:r>
+    </w:p>
+    <w:p>
+      <w:pPr>
+        <w:pStyle w:val="ListBullet"/>
+      </w:pPr>
+      <w:r>
+        <w:t>Bank of America</w:t>
+      </w:r>
+    </w:p>
+    <w:p>
+      <w:pPr>
+        <w:pStyle w:val="ListBullet"/>
+      </w:pPr>
+      <w:r>
+        <w:t>Belleville Boot Company</w:t>
+      </w:r>
+    </w:p>
+    <w:p>
+      <w:pPr>
+        <w:pStyle w:val="ListBullet"/>
+      </w:pPr>
+      <w:r>
+        <w:t>Blue Cross and Blue Shield of Kansas</w:t>
       </w:r>
     </w:p>
     <w:p>
@@ -917,7 +957,7 @@
         <w:pStyle w:val="ListBullet"/>
       </w:pPr>
       <w:r>
-        <w:t>Eby Construction</w:t>
+        <w:t>Eby Construction Company</w:t>
       </w:r>
     </w:p>
     <w:p>
@@ -925,7 +965,23 @@
         <w:pStyle w:val="ListBullet"/>
       </w:pPr>
       <w:r>
-        <w:t>Enza Financial</w:t>
+        <w:t>Emprise Bank</w:t>
+      </w:r>
+    </w:p>
+    <w:p>
+      <w:pPr>
+        <w:pStyle w:val="ListBullet"/>
+      </w:pPr>
+      <w:r>
+        <w:t>Enza Financial, LLC</w:t>
+      </w:r>
+    </w:p>
+    <w:p>
+      <w:pPr>
+        <w:pStyle w:val="ListBullet"/>
+      </w:pPr>
+      <w:r>
+        <w:t>John and Julie Dombo</w:t>
       </w:r>
     </w:p>
     <w:p>
@@ -942,6 +998,22 @@
       </w:pPr>
       <w:r>
         <w:t>Novolex</w:t>
+      </w:r>
+    </w:p>
+    <w:p>
+      <w:pPr>
+        <w:pStyle w:val="ListBullet"/>
+      </w:pPr>
+      <w:r>
+        <w:t>Pitt Plastics</w:t>
+      </w:r>
+    </w:p>
+    <w:p>
+      <w:pPr>
+        <w:pStyle w:val="ListBullet"/>
+      </w:pPr>
+      <w:r>
+        <w:t>R.K. Black, Inc.</w:t>
       </w:r>
     </w:p>
     <w:p>
@@ -981,7 +1053,7 @@
         <w:pStyle w:val="ListBullet"/>
       </w:pPr>
       <w:r>
-        <w:t>S.P. Richards</w:t>
+        <w:t>S.P. Richards Company</w:t>
       </w:r>
     </w:p>
     <w:p>

</xml_diff>

<commit_message>
Add the Envision Print credit to the back cover
"This program was produced by Envision Print, supporting meaningful
employment opportunities for people who are blind or have low vision."
Set in white at 12pt under the logo on page 20, and added to the large
print edition as its own section.

Co-Authored-By: Claude Opus 5 <noreply@anthropic.com>
Claude-Session: https://claude.ai/code/session_01WhP5V5GRsyjrhchLSMVTFf
</commit_message>
<xml_diff>
--- a/assets/program/2026-gala-program-large-print.docx
+++ b/assets/program/2026-gala-program-large-print.docx
@@ -1230,6 +1230,33 @@
         <w:t>Tonight takes many hands. Thank you to the volunteers who gave their time, and to the Wichita State Delta Gammas, whose service helps make this evening possible.</w:t>
       </w:r>
     </w:p>
+    <w:p>
+      <w:pPr>
+        <w:pStyle w:val="Heading2"/>
+        <w:pageBreakBefore w:val="0"/>
+      </w:pPr>
+      <w:r>
+        <w:t>Printed by Envision Print</w:t>
+      </w:r>
+    </w:p>
+    <w:p>
+      <w:pPr>
+        <w:keepNext/>
+        <w:spacing w:after="80"/>
+        <w:pBdr>
+          <w:bottom w:val="single" w:sz="18" w:space="1" w:color="E61636"/>
+        </w:pBdr>
+      </w:pPr>
+    </w:p>
+    <w:p>
+      <w:pPr/>
+      <w:r>
+        <w:rPr>
+          <w:b w:val="0"/>
+        </w:rPr>
+        <w:t>This program was produced by Envision Print, supporting meaningful employment opportunities for people who are blind or have low vision.</w:t>
+      </w:r>
+    </w:p>
     <w:sectPr>
       <w:footerReference w:type="default" r:id="rId9"/>
       <w:pgSz w:w="12240" w:h="15840"/>

</xml_diff>

<commit_message>
Add Service Steel Aerospace Corp. to the Silver sponsors
SSA, listed by its full name to match the rest of the page. Seventeen
Silver sponsors now, in both the print program and the large print.

Co-Authored-By: Claude Opus 5 <noreply@anthropic.com>
Claude-Session: https://claude.ai/code/session_01WhP5V5GRsyjrhchLSMVTFf
</commit_message>
<xml_diff>
--- a/assets/program/2026-gala-program-large-print.docx
+++ b/assets/program/2026-gala-program-large-print.docx
@@ -1021,6 +1021,14 @@
         <w:pStyle w:val="ListBullet"/>
       </w:pPr>
       <w:r>
+        <w:t>Service Steel Aerospace Corp.</w:t>
+      </w:r>
+    </w:p>
+    <w:p>
+      <w:pPr>
+        <w:pStyle w:val="ListBullet"/>
+      </w:pPr>
+      <w:r>
         <w:t>Vornado Air</w:t>
       </w:r>
     </w:p>

</xml_diff>

<commit_message>
Apply Molly's five comments, and fix two patch regressions
From her comments on the FINAL VERSION subtask:
- page 4: "Presented to 6 Meridian" capitalised
- page 5: both recognition lines fully bold
- page 10: the amounts stay in descending order and the descriptions
  swap, so $10,000 is the Workforce Innovation Center ask (now "education
  services") and $5,000 is Level Up, with the video landing after it
- page 12: "Raise your bidder number, listen for acknowledgment of your
  gift, and drop your bidder number in the basket."
- page 13: "not eligible to purchase or win."

Two of my own patches were off and are corrected:
- page 7: the cover box had wiped the red rule under MEET ADAH
- pages 7 and 10: redrawn text sat ~11pt high, pushing the $15,000 up
  against the red rule; both are back on the original baselines

Co-Authored-By: Claude Opus 5 <noreply@anthropic.com>
Claude-Session: https://claude.ai/code/session_01WhP5V5GRsyjrhchLSMVTFf
</commit_message>
<xml_diff>
--- a/assets/program/2026-gala-program-large-print.docx
+++ b/assets/program/2026-gala-program-large-print.docx
@@ -597,7 +597,7 @@
         <w:t xml:space="preserve">$10,000 </w:t>
       </w:r>
       <w:r>
-        <w:t>will fund transportation for teens with vision loss to attend Level Up, where they explore adaptive technology, college, and career options for a successful and independent future.</w:t>
+        <w:t>will provide career training and education services through the Workforce Innovation Center for a person who is blind or has low vision, offering a life-changing opportunity.</w:t>
       </w:r>
     </w:p>
     <w:p>
@@ -611,7 +611,7 @@
         <w:t xml:space="preserve">$5,000 </w:t>
       </w:r>
       <w:r>
-        <w:t>will provide career training and education through the Workforce Innovation Center for a person who is blind or has low vision, offering a life-changing opportunity.</w:t>
+        <w:t>will fund transportation for teens with vision loss to attend Level Up, where they explore adaptive technology, college, and career options for a successful and independent future.</w:t>
       </w:r>
     </w:p>
     <w:p>
@@ -701,7 +701,7 @@
         <w:rPr>
           <w:b w:val="0"/>
         </w:rPr>
-        <w:t>Raise your paddle, then drop your bidder number in the basket.</w:t>
+        <w:t>Raise your bidder number, listen for acknowledgment of your gift, and drop your bidder number in the basket.</w:t>
       </w:r>
     </w:p>
     <w:p>
@@ -780,7 +780,7 @@
         <w:rPr>
           <w:b w:val="0"/>
         </w:rPr>
-        <w:t>Subject to availability and blackout dates. Travel complete by December 2027. Employees of Envision are not eligible to purchase.</w:t>
+        <w:t>Subject to availability and blackout dates. Travel complete by December 2027. Employees of Envision are not eligible to purchase or win.</w:t>
       </w:r>
     </w:p>
     <w:p>

</xml_diff>